<commit_message>
Readiness Word set rebuilt (DOC-S16 sitemap lock)
Co-Authored-By: Claude Opus 5.5 <noreply@anthropic.com>
Claude-Session: https://claude.ai/code/session_012HHcRrzuvMBTL2FYxXtsyv
</commit_message>
<xml_diff>
--- a/treasury-platform/docs/30-readiness/word/DOC-S16-application-host-network-protection.docx
+++ b/treasury-platform/docs/30-readiness/word/DOC-S16-application-host-network-protection.docx
@@ -4505,6 +4505,111 @@
           <w:rtl/>
         </w:rPr>
         <w:t xml:space="preserve">تحديد الدخول (10 في الدقيقة) والتحقق بخطوتين (10 في 15 دقيقة) وإعادة التعيين (10 في الساعة) باقية كما في DOC-S04.</w:t>
+      </w:r>
+    </w:p>
+    <w:p>
+      <w:pPr>
+        <w:pStyle w:val="ListParagraph"/>
+        <w:numPr>
+          <w:ilvl w:val="0"/>
+          <w:numId w:val="2"/>
+        </w:numPr>
+        <w:bidi/>
+        <w:spacing w:after="70" w:before="0" w:line="300"/>
+      </w:pPr>
+      <w:r>
+        <w:rPr>
+          <w:rFonts w:ascii="Arial" w:cs="Arial" w:eastAsia="Arial" w:hAnsi="Arial"/>
+          <w:b/>
+          <w:bCs/>
+          <w:sz w:val="21"/>
+          <w:szCs w:val="21"/>
+          <w:rtl/>
+        </w:rPr>
+        <w:t xml:space="preserve">لا خريطة موقع ولا فهرسة:</w:t>
+      </w:r>
+      <w:r>
+        <w:rPr>
+          <w:rFonts w:ascii="Arial" w:cs="Arial" w:eastAsia="Arial" w:hAnsi="Arial"/>
+          <w:b w:val="false"/>
+          <w:bCs w:val="false"/>
+          <w:sz w:val="21"/>
+          <w:szCs w:val="21"/>
+          <w:rtl/>
+        </w:rPr>
+        <w:t xml:space="preserve"> لا يوجد </w:t>
+      </w:r>
+      <w:r>
+        <w:rPr>
+          <w:rFonts w:ascii="Courier New" w:cs="Courier New" w:eastAsia="Courier New" w:hAnsi="Courier New"/>
+          <w:b w:val="false"/>
+          <w:bCs w:val="false"/>
+          <w:color w:val="1F2937"/>
+          <w:sz w:val="18"/>
+          <w:szCs w:val="18"/>
+          <w:shd w:fill="F1F3F5" w:color="auto" w:val="clear"/>
+          <w:rtl/>
+        </w:rPr>
+        <w:t xml:space="preserve">‎sitemap.xml‎</w:t>
+      </w:r>
+      <w:r>
+        <w:rPr>
+          <w:rFonts w:ascii="Arial" w:cs="Arial" w:eastAsia="Arial" w:hAnsi="Arial"/>
+          <w:b w:val="false"/>
+          <w:bCs w:val="false"/>
+          <w:sz w:val="21"/>
+          <w:szCs w:val="21"/>
+          <w:rtl/>
+        </w:rPr>
+        <w:t xml:space="preserve">، وكل مسار يبدأ بـ sitemap يُرد بـ 404 في التطبيق وفي Caddy. و</w:t>
+      </w:r>
+      <w:r>
+        <w:rPr>
+          <w:rFonts w:ascii="Courier New" w:cs="Courier New" w:eastAsia="Courier New" w:hAnsi="Courier New"/>
+          <w:b w:val="false"/>
+          <w:bCs w:val="false"/>
+          <w:color w:val="1F2937"/>
+          <w:sz w:val="18"/>
+          <w:szCs w:val="18"/>
+          <w:shd w:fill="F1F3F5" w:color="auto" w:val="clear"/>
+          <w:rtl/>
+        </w:rPr>
+        <w:t xml:space="preserve">‎robots.txt‎</w:t>
+      </w:r>
+      <w:r>
+        <w:rPr>
+          <w:rFonts w:ascii="Arial" w:cs="Arial" w:eastAsia="Arial" w:hAnsi="Arial"/>
+          <w:b w:val="false"/>
+          <w:bCs w:val="false"/>
+          <w:sz w:val="21"/>
+          <w:szCs w:val="21"/>
+          <w:rtl/>
+        </w:rPr>
+        <w:t xml:space="preserve"> يمنع كل المسارات دون أن يسمي أيًّا منها. وكل رد يحمل </w:t>
+      </w:r>
+      <w:r>
+        <w:rPr>
+          <w:rFonts w:ascii="Courier New" w:cs="Courier New" w:eastAsia="Courier New" w:hAnsi="Courier New"/>
+          <w:b w:val="false"/>
+          <w:bCs w:val="false"/>
+          <w:color w:val="1F2937"/>
+          <w:sz w:val="18"/>
+          <w:szCs w:val="18"/>
+          <w:shd w:fill="F1F3F5" w:color="auto" w:val="clear"/>
+          <w:rtl/>
+        </w:rPr>
+        <w:t xml:space="preserve">‎X-Robots-Tag: noindex, nofollow, noarchive, nosnippet‎</w:t>
+      </w:r>
+      <w:r>
+        <w:rPr>
+          <w:rFonts w:ascii="Arial" w:cs="Arial" w:eastAsia="Arial" w:hAnsi="Arial"/>
+          <w:b w:val="false"/>
+          <w:bCs w:val="false"/>
+          <w:sz w:val="21"/>
+          <w:szCs w:val="21"/>
+          <w:rtl/>
+        </w:rPr>
+        <w:t xml:space="preserve">، والصفحة تحمل وسم robots بالمعنى نفسه. والمسار الذي يبدو ملفًا (فيه نقطة في آخره) ولا يوجد يُرد بـ 404، لا بصفحة التطبيق، فلا يكشف الفحص الآلي شيئًا.</w:t>
       </w:r>
     </w:p>
     <w:p>

</xml_diff>